<commit_message>
deal screen: update anthropic.docx
</commit_message>
<xml_diff>
--- a/hub/static/research/companies/anthropic.docx
+++ b/hub/static/research/companies/anthropic.docx
@@ -62,7 +62,7 @@
           <w:color w:val="1A1A1A"/>
           <w:sz w:val="32"/>
         </w:rPr>
-        <w:t>3.8 / 4.0</w:t>
+        <w:t>3.6 / 4.0</w:t>
       </w:r>
       <w:r>
         <w:rPr>
@@ -72,7 +72,7 @@
           <w:color w:val="828282"/>
           <w:sz w:val="21"/>
         </w:rPr>
-        <w:t xml:space="preserve">   (raw 3.7)</w:t>
+        <w:t xml:space="preserve">   (raw 3.5)</w:t>
       </w:r>
       <w:r>
         <w:rPr>
@@ -267,7 +267,7 @@
                 <w:color w:val="3C3C3C"/>
                 <w:sz w:val="18"/>
               </w:rPr>
-              <w:t>Anthropic is headquartered in San Francisco, California, and its Series F was led by ICONIQ, a Tier 1+ firm under the rubric; the company’s most recent disclosed large round also shows major institutional co-participation. Direct co-invest access is not publicly confirmed, but the lead quality and new-money Series B+ pattern are strong on the disclosed record.[6][8]</w:t>
+              <w:t>Anthropic is a San Francisco–based AI safety and research company that has raised a Series F of $13B at a $183B post-money valuation led by ICONIQ, a Tier 1+ growth investor, with repeat participation from other Tier 1s such as Lightspeed and Spark.[6][8]</w:t>
             </w:r>
           </w:p>
         </w:tc>
@@ -369,7 +369,7 @@
                 <w:color w:val="3C3C3C"/>
                 <w:sz w:val="18"/>
               </w:rPr>
-              <w:t>Anthropic was founded by senior AI researchers and operators with strong domain authority in frontier models, and the company’s press profile and repeated ability to raise very large rounds support a top-tier recruiting and execution signal. Public coverage in the provided results does not verify every founder detail, but the team signal is clearly elite rather than merely capable.[1][6][8]</w:t>
+              <w:t>Anthropic was founded by former senior OpenAI researchers including Dario and Daniela Amodei, who led core safety and research teams; the company has since scaled headcount rapidly and attracted top-tier technical talent and investors across multiple large rounds, signaling deep domain authority and strong recruiting.[1][6]</w:t>
             </w:r>
           </w:p>
         </w:tc>
@@ -431,7 +431,7 @@
                 <w:color w:val="1A1A1A"/>
                 <w:sz w:val="19"/>
               </w:rPr>
-              <w:t>4</w:t>
+              <w:t>3</w:t>
             </w:r>
             <w:r>
               <w:rPr>
@@ -471,7 +471,7 @@
                 <w:color w:val="3C3C3C"/>
                 <w:sz w:val="18"/>
               </w:rPr>
-              <w:t>The search results do not disclose ARR, growth, NDR, or burn, but Anthropic’s valuation progression to $183B in Series F and $965B in Series H indicates exceptional scale and market demand. With no usable operating metrics in the provided results, this is an estimated strong-fundamentals read rather than a confirmed one.[7][8]</w:t>
+              <w:t>Anthropic has raised over $33B in total funding with successive very large late-stage rounds (Series F at $183B valuation, then larger rounds reportedly in the tens of billions), indicating substantial customer traction and strategic cloud partnerships, but no public disclosure of ARR, growth, NDR, or burn; given its scale and role as a leading foundation model provider, fundamentals are likely strong but key metrics remain undisclosed, so score is based on qualitative moat and scale rather than confirmed numbers.[2][6][8]</w:t>
             </w:r>
           </w:p>
         </w:tc>
@@ -573,7 +573,7 @@
                 <w:color w:val="3C3C3C"/>
                 <w:sz w:val="18"/>
               </w:rPr>
-              <w:t>At very high private valuations, even a strong company can face meaningful multiple compression unless growth remains extraordinary, so the base-case MOIC is more likely in the 3-6x range than a clear 6x+ from this entry point. The exit path is visible, but the entry price implies discipline on future upside.[7][8]</w:t>
+              <w:t>Entry at or near a late-stage Anthropic valuation in the high hundreds of billions (e.g., $183B Series F with later rounds rumored at much higher valuations) implies a large absolute TAM in frontier AI but also significant competition and compression risk; a 3–6x MOIC appears plausible in a strong but not guaranteed base case, while 6x+ would require Anthropic to become one of a very small number of dominant global AI platforms, leaving meaningful execution and regulatory risk.</w:t>
             </w:r>
           </w:p>
         </w:tc>
@@ -675,7 +675,7 @@
                 <w:color w:val="3C3C3C"/>
                 <w:sz w:val="18"/>
               </w:rPr>
-              <w:t>Anthropic is explicitly an AI safety and research company building steerable, interpretable, robust AI, so AI is the product and the moat rather than a wrapper feature. This is core model-layer AI with defensibility tied to research, infrastructure, and model quality.[1][8]</w:t>
+              <w:t>Anthropic is a pure-play AI foundation model company focused on building large-scale generative models (Claude) and AI safety research; its moat centers on proprietary model architectures, training infrastructure, and data flywheels, and the product itself is a frontier model rather than an application-layer feature that could be trivially absorbed into another model’s plugin ecosystem.[1][6]</w:t>
             </w:r>
           </w:p>
         </w:tc>
@@ -777,7 +777,7 @@
                 <w:color w:val="3C3C3C"/>
                 <w:sz w:val="18"/>
               </w:rPr>
-              <w:t>No recurring management fee or adverse carry/upfront fee structure is disclosed in the provided results, so there is no evidence of a hard term-based pass. In the absence of deal-specific term disclosures, the baseline 0/0/10 assumption is the closest fit.[none found]</w:t>
+              <w:t>Specific co-invest or SPV terms for Anthropic’s late-stage rounds are not publicly disclosed; given typical top-tier late-stage AI rounds, standard 0% recurring management fee, 0% upfront fee, and ~10% carry structures for quality co-invest SPVs are a reasonable baseline assumption in the absence of contrary evidence, so the terms dimension is scored at the neutral rubric anchor with no confirmed fee or carry red flags.[none found]</w:t>
             </w:r>
           </w:p>
         </w:tc>
@@ -819,7 +819,7 @@
           <w:color w:val="1A1A1A"/>
           <w:sz w:val="21"/>
         </w:rPr>
-        <w:t xml:space="preserve">Anthropic aligns strongly with ID8’s AI thesis: it is a pure-play frontier AI company, and AI is structurally central to the business rather than a feature layer. The lead signal is directionally strong because the disclosed financings show Tier 1 institutional involvement, but the provided results do not confirm the specific ID8-required combination of new-money Tier 1 lead plus direct co-invest access, so this is not a perfect thesis match on round dynamics. </w:t>
+        <w:t>Anthropic is a San Francisco–based, late-stage foundation-model company squarely within ID8’s geographic and AI mandate, with a Tier 1+/Tier 1 investor stack and a recent Series F led by ICONIQ, satisfying the thesis requirement of top-tier new money at Series B+.[6][8] The founding team has elite AI safety pedigree from OpenAI, and the company appears to have scaled into a leading frontier model provider, but core financial metrics remain undisclosed, making the fundamentals and return profile strong but not fully verifiable at current very high valuations.[1][2][6] Overall, the deal aligns with ID8’s AI and lead-investor thesis, though late-stage valuation and competitive intensity temper return expectations into the 3–6x range rather than a clearly 6x+ base case.</w:t>
       </w:r>
     </w:p>
     <w:p>
@@ -834,7 +834,7 @@
           <w:color w:val="828282"/>
           <w:sz w:val="18"/>
         </w:rPr>
-        <w:t>Confidence: low</w:t>
+        <w:t>Confidence: medium</w:t>
       </w:r>
     </w:p>
     <w:sectPr>

</xml_diff>